<commit_message>
Retip docs: per-mode training, prediction and comparison
Module and pipeline portal content, Registration and Container_Manual follow
retip_train 1.1, retip_predict 1.2 and retip_compare 1.1: a table may mix RP
and HILIC, a model is trained per mode, rows of an untrained mode are marked
no_trained_model, compare runs per mode with model optional (auto), rt_unit
defaults to min (the default models' unit). Word files regenerated.

Co-Authored-By: Claude Opus 5.5 <noreply@anthropic.com>
</commit_message>
<xml_diff>
--- a/docs/Retip/modules/Portal_Content.docx
+++ b/docs/Retip/modules/Portal_Content.docx
@@ -270,6 +270,19 @@
       </w:pPr>
       <w:r>
         <w:t xml:space="preserve">RTpred는 CLOSHA 3.0에서 처음 배포하므로 모든 모듈의 버전은 1.0입니다.</w:t>
+      </w:r>
+    </w:p>
+    <w:p>
+      <w:pPr>
+        <w:pStyle w:val="ListParagraph"/>
+        <w:numPr>
+          <w:ilvl w:val="0"/>
+          <w:numId w:val="2"/>
+        </w:numPr>
+        <w:spacing w:after="80"/>
+      </w:pPr>
+      <w:r>
+        <w:t xml:space="preserve">분리 모드: 서울대 의도(2026-10-23 확인)에 따라 학습은 한 표의 RP·HILIC를 모드별로 나눠 각각 학습하고, 예측은 행마다 그 모드의 모델을 씁니다. 사용자 모델로 예측할 때 학습하지 않은 모드의 행은 예측하지 않고 표시만 합니다. 이미지와 mdcc 코드는 그대로이며 래퍼 스크립트만 바뀌었습니다.</w:t>
       </w:r>
     </w:p>
     <w:p>
@@ -1089,7 +1102,7 @@
           <w:sz w:val="18"/>
           <w:szCs w:val="18"/>
         </w:rPr>
-        <w:t xml:space="preserve">scripts/Retip/retip_predict.1.1.py</w:t>
+        <w:t xml:space="preserve">scripts/Retip/retip_predict.1.2.py</w:t>
       </w:r>
       <w:r>
         <w:rPr>
@@ -2315,7 +2328,7 @@
         <w:spacing w:after="80"/>
       </w:pPr>
       <w:r>
-        <w:t xml:space="preserve">기본으로는 이미지에 들어 있는 RP·HILIC 기본 모델(best: WeightedEnsemble_L3)을 씁니다. model_dir에 사용자 모델 학습 결과 폴더를 주면 그 모델로 예측합니다.</w:t>
+        <w:t xml:space="preserve">기본으로는 이미지에 들어 있는 RP·HILIC 기본 모델(best: WeightedEnsemble_L3)을 씁니다. model_dir에 사용자 모델 학습 결과 폴더를 주면 행마다 그 모드의 학습 모델로 예측합니다. 학습하지 않은 모드의 행은 예측하지 않고 결과에 표시(no_trained_model)만 합니다.</w:t>
       </w:r>
     </w:p>
     <w:p>
@@ -2390,7 +2403,7 @@
         <w:spacing w:after="80"/>
       </w:pPr>
       <w:r>
-        <w:t xml:space="preserve">By default the RP and HILIC models bundled in the image (best: WeightedEnsemble_L3) are used; with a training output folder in model_dir, that user model predicts instead.</w:t>
+        <w:t xml:space="preserve">By default the RP and HILIC models bundled in the image (best: WeightedEnsemble_L3) are used; with a training output folder in model_dir, each row is predicted by the trained model of its mode, and rows of a mode that was not trained are kept and marked (no_trained_model) without a prediction.</w:t>
       </w:r>
     </w:p>
     <w:p>
@@ -2755,7 +2768,7 @@
                 <w:sz w:val="18"/>
                 <w:szCs w:val="18"/>
               </w:rPr>
-              <w:t xml:space="preserve">화합물 표(CSV 또는 XLSX, 한 행이 화합물 하나). SMILES 열 필수. model_type 열(RP/HILIC)과 측정 RT 열은 선택</w:t>
+              <w:t xml:space="preserve">화합물 표(CSV 또는 XLSX, 한 행이 화합물 하나). SMILES 열 필수. model_type 열(RP/HILIC)과 측정 RT 열은 선택이며, 모드가 섞여도 됨</w:t>
             </w:r>
           </w:p>
         </w:tc>
@@ -2775,7 +2788,7 @@
                 <w:sz w:val="18"/>
                 <w:szCs w:val="18"/>
               </w:rPr>
-              <w:t xml:space="preserve">Compound table (CSV or XLSX, one compound per row) with a SMILES column; model_type (RP/HILIC) and measured RT columns are optional</w:t>
+              <w:t xml:space="preserve">Compound table (CSV or XLSX, one compound per row) with a SMILES column; model_type (RP/HILIC) and measured RT columns are optional, and modes may be mixed</w:t>
             </w:r>
           </w:p>
         </w:tc>
@@ -3039,7 +3052,7 @@
                 <w:sz w:val="18"/>
                 <w:szCs w:val="18"/>
               </w:rPr>
-              <w:t xml:space="preserve">예측에 쓸 모델. default 또는 빈 값 = 이미지 안 기본 RP·HILIC 모델. 학습 모델을 쓰려면 사용자 모델 학습 결과 폴더(안에 result/model/model_manifest.json이 있어야 함)</w:t>
+              <w:t xml:space="preserve">예측에 쓸 모델. default 또는 빈 값 = 이미지 안 기본 RP·HILIC 모델. 학습 모델을 쓰려면 retip_train 결과 폴더. 행마다 그 모드의 학습 모델로 예측하고, 학습하지 않은 모드의 행은 예측하지 않고 표시만 함(parse_status=no_trained_model)</w:t>
             </w:r>
           </w:p>
         </w:tc>
@@ -3059,7 +3072,7 @@
                 <w:sz w:val="18"/>
                 <w:szCs w:val="18"/>
               </w:rPr>
-              <w:t xml:space="preserve">Model used for prediction. default or empty = the bundled default RP and HILIC models. For a trained model, the training output folder (with result/model/model_manifest.json)</w:t>
+              <w:t xml:space="preserve">Model used for prediction. default or empty = the bundled default RP and HILIC models. For trained models, the retip_train output folder: each row uses the trained model of its mode, and rows of an untrained mode are kept but not predicted (parse_status=no_trained_model)</w:t>
             </w:r>
           </w:p>
         </w:tc>
@@ -3181,7 +3194,7 @@
                 <w:sz w:val="18"/>
                 <w:szCs w:val="18"/>
               </w:rPr>
-              <w:t xml:space="preserve">분리 모드(auto, RP, HILIC). 기본 모델에서 auto = 표의 model_type 열을 행마다 사용(섞어도 됨). 학습 모델에서 auto = 모델의 모드</w:t>
+              <w:t xml:space="preserve">분리 모드(auto, RP, HILIC). auto = 표의 model_type 열을 행마다 사용. 열이 없는 표는 기본 모델에서는 RP 또는 HILIC 지정이 필요하고, 학습 모델에서는 한 모드만 학습했을 때 그 모드로 봄. RP/HILIC = 모든 행을 그 모드로 봄(model_type 열이 있으면 같아야 함)</w:t>
             </w:r>
           </w:p>
         </w:tc>
@@ -3201,7 +3214,7 @@
                 <w:sz w:val="18"/>
                 <w:szCs w:val="18"/>
               </w:rPr>
-              <w:t xml:space="preserve">Separation mode (auto, RP, HILIC). With the default models, auto uses the model_type column per row (modes may be mixed); with a trained model, auto takes the model's mode</w:t>
+              <w:t xml:space="preserve">Separation mode (auto, RP, HILIC). auto uses the model_type column per row. A table without the column needs RP or HILIC with the default models, and is taken as the trained mode when only one mode was trained. RP/HILIC treats every row as that mode (a model_type column must agree)</w:t>
             </w:r>
           </w:p>
         </w:tc>
@@ -3648,7 +3661,7 @@
                 <w:sz w:val="18"/>
                 <w:szCs w:val="18"/>
               </w:rPr>
-              <w:t xml:space="preserve">RP 또는 HILIC. 기본 모델에서 model=auto이면 필수</w:t>
+              <w:t xml:space="preserve">RP 또는 HILIC(행마다, 섞어도 됨). model=auto이면 필수(학습 모델이 한 모드뿐이면 생략 가능)</w:t>
             </w:r>
           </w:p>
         </w:tc>
@@ -4008,7 +4021,7 @@
                 <w:sz w:val="18"/>
                 <w:szCs w:val="18"/>
               </w:rPr>
-              <w:t xml:space="preserve">기본 모델은 서울대가 학습해 제공한 RP·HILIC 모델입니다. 기본 모델의 학습 LC 조건(컬럼, 이동상, gradient)과 RT 단위는 제공 자료에서 확인되지 않아, 실측 RT와 비교할 때는 같은 조건인지 주의해 주세요.</w:t>
+              <w:t xml:space="preserve">기본 모델은 서울대가 학습해 제공한 RP·HILIC 모델이며 RT 단위는 분(min)입니다. 기본 모델의 학습 LC 조건(컬럼, 이동상, gradient)은 제공 자료에서 확인되지 않아, 실측 RT와 비교할 때는 같은 조건인지 주의해 주세요.</w:t>
             </w:r>
           </w:p>
         </w:tc>
@@ -4028,7 +4041,7 @@
                 <w:sz w:val="18"/>
                 <w:szCs w:val="18"/>
               </w:rPr>
-              <w:t xml:space="preserve">The default RP and HILIC models were trained and provided by SNU. Their LC conditions (column, mobile phase, gradient) and RT unit are not stated in the provided material, so take care when comparing with your measured RT.</w:t>
+              <w:t xml:space="preserve">The default RP and HILIC models were trained and provided by SNU, with RT in minutes. Their LC conditions (column, mobile phase, gradient) are not stated in the provided material, so take care when comparing with your measured RT.</w:t>
             </w:r>
           </w:p>
         </w:tc>
@@ -4050,7 +4063,7 @@
                 <w:sz w:val="18"/>
                 <w:szCs w:val="18"/>
               </w:rPr>
-              <w:t xml:space="preserve">학습 모델로 예측하면 표의 model_type 열이 모델의 모드와 같아야 합니다. 다른 모드가 섞인 표는 서울대 코드가 "Do not mix chromatography modes"로 멈춥니다. 모드별로 표를 나눠 주세요.</w:t>
+              <w:t xml:space="preserve">학습 모델로 예측하면 행마다 그 모드의 학습 모델을 씁니다. 학습하지 않은 모드의 행(예: RP만 학습했을 때 HILIC 행)은 결과 표에 남되 predicted_rt가 비고 parse_status=no_trained_model로 표시되며, 로그에 그 행 수가 경고로 남습니다. 그 행까지 예측하려면 그 모드도 학습하거나 기본 모델(model_dir 비움)로 따로 실행해 주세요. 표의 어떤 행도 학습한 모드가 아니면 멈춥니다.</w:t>
             </w:r>
           </w:p>
         </w:tc>
@@ -4070,7 +4083,7 @@
                 <w:sz w:val="18"/>
                 <w:szCs w:val="18"/>
               </w:rPr>
-              <w:t xml:space="preserve">With a trained model, the model_type column must match the model's mode; a table mixing modes stops in the SNU code with "Do not mix chromatography modes". Split the table by mode.</w:t>
+              <w:t xml:space="preserve">With trained models each row uses the trained model of its mode. Rows of a mode that was not trained (for example HILIC rows when only RP was trained) stay in the table with an empty predicted_rt and parse_status=no_trained_model, and the log warns with their number. To predict them, train that mode too or run separately with the default models (empty model_dir). The run stops when no row has a trained mode.</w:t>
             </w:r>
           </w:p>
         </w:tc>
@@ -4134,7 +4147,7 @@
                 <w:sz w:val="18"/>
                 <w:szCs w:val="18"/>
               </w:rPr>
-              <w:t xml:space="preserve">모델이 낸 RT를 보정하거나 단위를 바꾸지 않습니다.</w:t>
+              <w:t xml:space="preserve">모델이 낸 RT를 보정하거나 단위를 바꾸지 않습니다. 학습 모델로 예측하면 rt_unit 열에 학습 때의 단위가 적힙니다.</w:t>
             </w:r>
           </w:p>
         </w:tc>
@@ -4154,7 +4167,7 @@
                 <w:sz w:val="18"/>
                 <w:szCs w:val="18"/>
               </w:rPr>
-              <w:t xml:space="preserve">The RT returned by the model is neither corrected nor converted.</w:t>
+              <w:t xml:space="preserve">The RT returned by the model is neither corrected nor converted; with trained models the rt_unit column gives the unit used in training.</w:t>
             </w:r>
           </w:p>
         </w:tc>
@@ -5358,6 +5371,45 @@
     <w:p/>
     <w:p>
       <w:pPr>
+        <w:spacing w:after="120"/>
+      </w:pPr>
+      <w:r>
+        <w:rPr>
+          <w:b/>
+          <w:bCs/>
+          <w:color w:val="B0B0B0"/>
+          <w:sz w:val="18"/>
+          <w:szCs w:val="18"/>
+        </w:rPr>
+        <w:t xml:space="preserve">[내부 메모 · 붙여 넣지 마세요] </w:t>
+      </w:r>
+      <w:r>
+        <w:rPr>
+          <w:color w:val="8A8F99"/>
+          <w:sz w:val="18"/>
+          <w:szCs w:val="18"/>
+        </w:rPr>
+        <w:t xml:space="preserve">등록 메모: 작업 파일 </w:t>
+      </w:r>
+      <w:r>
+        <w:rPr>
+          <w:color w:val="8A8F99"/>
+          <w:sz w:val="18"/>
+          <w:szCs w:val="18"/>
+        </w:rPr>
+        <w:t xml:space="preserve">scripts/Retip/retip_train.1.1.py</w:t>
+      </w:r>
+      <w:r>
+        <w:rPr>
+          <w:color w:val="8A8F99"/>
+          <w:sz w:val="18"/>
+          <w:szCs w:val="18"/>
+        </w:rPr>
+        <w:t xml:space="preserve">를 배포 번호 1.0으로 올립니다.</w:t>
+      </w:r>
+    </w:p>
+    <w:p>
+      <w:pPr>
         <w:spacing w:after="100" w:before="200"/>
       </w:pPr>
       <w:r>
@@ -6559,6 +6611,19 @@
         <w:spacing w:after="80"/>
       </w:pPr>
       <w:r>
+        <w:t xml:space="preserve">표의 model_type 열에 있는 분리 모드(RP, HILIC)마다 따로 학습합니다. RP만 있으면 RP 모델만, 둘 다 있으면 두 모델을 한 번에 만듭니다.</w:t>
+      </w:r>
+    </w:p>
+    <w:p>
+      <w:pPr>
+        <w:pStyle w:val="ListParagraph"/>
+        <w:numPr>
+          <w:ilvl w:val="0"/>
+          <w:numId w:val="2"/>
+        </w:numPr>
+        <w:spacing w:after="80"/>
+      </w:pPr>
+      <w:r>
         <w:t xml:space="preserve">같은 구조가 train, validation, test에 섞이지 않도록 정규화한 구조 단위로 나누고, 먼저 예약 test를 떼어 둡니다.</w:t>
       </w:r>
     </w:p>
@@ -6622,6 +6687,19 @@
       </w:pPr>
       <w:r>
         <w:t xml:space="preserve">Trains an RT prediction model from a table of retention times measured under the user's own LC conditions. Labs using a column, mobile phase or gradient different from the default models need a model for their conditions before predicted RTs can filter candidates.</w:t>
+      </w:r>
+    </w:p>
+    <w:p>
+      <w:pPr>
+        <w:pStyle w:val="ListParagraph"/>
+        <w:numPr>
+          <w:ilvl w:val="0"/>
+          <w:numId w:val="2"/>
+        </w:numPr>
+        <w:spacing w:after="80"/>
+      </w:pPr>
+      <w:r>
+        <w:t xml:space="preserve">Each separation mode in the model_type column (RP, HILIC) is trained separately: RP rows only give an RP model, and both modes give two models in one run.</w:t>
       </w:r>
     </w:p>
     <w:p>
@@ -6999,7 +7077,7 @@
                 <w:sz w:val="18"/>
                 <w:szCs w:val="18"/>
               </w:rPr>
-              <w:t xml:space="preserve">학습 표(CSV 또는 XLSX). SMILES와 측정 RT 열 필수. 한 분리 모드(RP 또는 HILIC)만, 정제 후 25행·서로 다른 구조 15개 이상</w:t>
+              <w:t xml:space="preserve">학습 표(CSV 또는 XLSX). SMILES와 측정 RT 열 필수. model_type 열(RP/HILIC)이 있으면 모드마다 따로 학습하며, 한 표에 섞여도 됨. 모드마다 정제 후 25행, 서로 다른 구조 15개 이상 필요</w:t>
             </w:r>
           </w:p>
         </w:tc>
@@ -7019,7 +7097,7 @@
                 <w:sz w:val="18"/>
                 <w:szCs w:val="18"/>
               </w:rPr>
-              <w:t xml:space="preserve">Training table (CSV or XLSX) with SMILES and measured RT, one separation mode (RP or HILIC), at least 25 rows and 15 distinct structures after cleaning</w:t>
+              <w:t xml:space="preserve">Training table (CSV or XLSX) with SMILES and measured RT. With a model_type column (RP/HILIC), each mode is trained separately and modes may be mixed in one table. Each mode needs at least 25 rows and 15 distinct structures after cleaning</w:t>
             </w:r>
           </w:p>
         </w:tc>
@@ -7141,7 +7219,7 @@
                 <w:sz w:val="18"/>
                 <w:szCs w:val="18"/>
               </w:rPr>
-              <w:t xml:space="preserve">결과 폴더. result/에 model/(학습 모델), reserved_test.csv, validation_leaderboard.csv, split_assignments.csv, rejected_rows.csv, training.png·.svg, report.html, manifest.json</w:t>
+              <w:t xml:space="preserve">결과 폴더. result/에 모드별 폴더(RP/, HILIC/: model/, reserved_test.csv, validation_leaderboard.csv, split_assignments.csv, rejected_rows.csv, training.png·.svg, report.html, manifest.json)와 train_summary.tsv, logs/에 로그</w:t>
             </w:r>
           </w:p>
         </w:tc>
@@ -7161,7 +7239,7 @@
                 <w:sz w:val="18"/>
                 <w:szCs w:val="18"/>
               </w:rPr>
-              <w:t xml:space="preserve">Output folder: result/ holds model/ (trained models), reserved_test.csv, validation_leaderboard.csv, split_assignments.csv, rejected_rows.csv, training.png and .svg, report.html and manifest.json</w:t>
+              <w:t xml:space="preserve">Output folder: result/ holds a folder per mode (RP/, HILIC/: model/, reserved_test.csv, validation_leaderboard.csv, split_assignments.csv, rejected_rows.csv, training.png and .svg, report.html, manifest.json) and train_summary.tsv; logs/ holds the logs</w:t>
             </w:r>
           </w:p>
         </w:tc>
@@ -7283,7 +7361,7 @@
                 <w:sz w:val="18"/>
                 <w:szCs w:val="18"/>
               </w:rPr>
-              <w:t xml:space="preserve">분리 모드(auto, RP, HILIC). auto = 표의 model_type 열에 있는 한 모드. 열이 없거나 모드가 섞이면 멈춤</w:t>
+              <w:t xml:space="preserve">학습할 모드(auto, RP, HILIC). auto = model_type 열에 있는 모드 전부(RP만 있으면 RP 모델만). RP/HILIC = 그 모드 행만 학습. model_type 열이 없는 표는 RP 또는 HILIC를 지정해야 함</w:t>
             </w:r>
           </w:p>
         </w:tc>
@@ -7303,7 +7381,7 @@
                 <w:sz w:val="18"/>
                 <w:szCs w:val="18"/>
               </w:rPr>
-              <w:t xml:space="preserve">Separation mode (auto, RP, HILIC). auto takes the single mode of the model_type column; stops if the column is missing or mixes modes</w:t>
+              <w:t xml:space="preserve">Modes to train (auto, RP, HILIC). auto = every mode in the model_type column (RP rows only give only an RP model). RP/HILIC = train only those rows. A table without a model_type column needs RP or HILIC</w:t>
             </w:r>
           </w:p>
         </w:tc>
@@ -7547,7 +7625,7 @@
                 <w:sz w:val="18"/>
                 <w:szCs w:val="18"/>
               </w:rPr>
-              <w:t xml:space="preserve">auto</w:t>
+              <w:t xml:space="preserve">min</w:t>
             </w:r>
           </w:p>
         </w:tc>
@@ -7567,7 +7645,7 @@
                 <w:sz w:val="18"/>
                 <w:szCs w:val="18"/>
               </w:rPr>
-              <w:t xml:space="preserve">RT 단위 이름(예: min). 값은 바꾸지 않고 기록만 함. auto 또는 빈 값 = model unit</w:t>
+              <w:t xml:space="preserve">측정 RT의 단위 이름. 값은 바꾸지 않고 기록만 함. 빈 값 = min</w:t>
             </w:r>
           </w:p>
         </w:tc>
@@ -7587,7 +7665,7 @@
                 <w:sz w:val="18"/>
                 <w:szCs w:val="18"/>
               </w:rPr>
-              <w:t xml:space="preserve">RT unit label (for example min); values are not converted. auto or empty = model unit</w:t>
+              <w:t xml:space="preserve">Unit label of the measured RT; values are not converted. Empty = min</w:t>
             </w:r>
           </w:p>
         </w:tc>
@@ -7709,7 +7787,7 @@
                 <w:sz w:val="18"/>
                 <w:szCs w:val="18"/>
               </w:rPr>
-              <w:t xml:space="preserve">AutoGluon 학습 시간 예산(초). 전처리·저장을 포함한 전체 실행 시간 제한은 아님</w:t>
+              <w:t xml:space="preserve">모드마다 AutoGluon 학습 시간 예산(초). 전처리·저장을 포함한 전체 실행 시간 제한은 아님</w:t>
             </w:r>
           </w:p>
         </w:tc>
@@ -7729,7 +7807,7 @@
                 <w:sz w:val="18"/>
                 <w:szCs w:val="18"/>
               </w:rPr>
-              <w:t xml:space="preserve">AutoGluon training budget in seconds; not a limit on the whole run including preprocessing and saving</w:t>
+              <w:t xml:space="preserve">AutoGluon training budget per mode in seconds; not a limit on the whole run including preprocessing and saving</w:t>
             </w:r>
           </w:p>
         </w:tc>
@@ -9090,7 +9168,7 @@
                 <w:sz w:val="18"/>
                 <w:szCs w:val="18"/>
               </w:rPr>
-              <w:t xml:space="preserve">선택</w:t>
+              <w:t xml:space="preserve">조건부</w:t>
             </w:r>
           </w:p>
         </w:tc>
@@ -9110,7 +9188,7 @@
                 <w:sz w:val="18"/>
                 <w:szCs w:val="18"/>
               </w:rPr>
-              <w:t xml:space="preserve">RP 또는 HILIC 한 가지. 없으면 model 인자로 지정</w:t>
+              <w:t xml:space="preserve">RP 또는 HILIC(행마다, 섞어도 됨). 없으면 model 인자로 RP 또는 HILIC 지정</w:t>
             </w:r>
           </w:p>
         </w:tc>
@@ -9230,7 +9308,7 @@
           <w:sz w:val="19"/>
           <w:szCs w:val="19"/>
         </w:rPr>
-        <w:t xml:space="preserve">compound_id,SMILES,RT</w:t>
+        <w:t xml:space="preserve">compound_id,SMILES,RT,model_type</w:t>
       </w:r>
     </w:p>
     <w:p>
@@ -9244,7 +9322,7 @@
           <w:sz w:val="19"/>
           <w:szCs w:val="19"/>
         </w:rPr>
-        <w:t xml:space="preserve">S001,CCO,2.10</w:t>
+        <w:t xml:space="preserve">S001,CCO,2.10,RP</w:t>
       </w:r>
     </w:p>
     <w:p>
@@ -9258,7 +9336,7 @@
           <w:sz w:val="19"/>
           <w:szCs w:val="19"/>
         </w:rPr>
-        <w:t xml:space="preserve">S002,CCN,2.80</w:t>
+        <w:t xml:space="preserve">S002,CCN,2.80,RP</w:t>
       </w:r>
     </w:p>
     <w:p>
@@ -9272,7 +9350,7 @@
           <w:sz w:val="19"/>
           <w:szCs w:val="19"/>
         </w:rPr>
-        <w:t xml:space="preserve">S003,O=C(O)c1ccccc1,5.40</w:t>
+        <w:t xml:space="preserve">S003,O=C(O)c1ccccc1,5.40,HILIC</w:t>
       </w:r>
     </w:p>
     <w:p/>
@@ -9374,7 +9452,7 @@
                 <w:sz w:val="18"/>
                 <w:szCs w:val="18"/>
               </w:rPr>
-              <w:t xml:space="preserve">한 번 실행에 한 분리 모드(RP 또는 HILIC)만 학습합니다. 두 모드가 섞인 표는 멈추므로 모드별로 나눠 실행해 주세요.</w:t>
+              <w:t xml:space="preserve">한 표에 RP와 HILIC가 섞여 있으면 모드마다 따로 학습해 result/RP/, result/HILIC/에 저장합니다. 한 모드만 실패하면(예: 행이 모자람) 다른 모드는 그대로 저장하고 경고를 남기며, train_summary.tsv의 Status로 확인할 수 있습니다. 모든 모드가 실패할 때만 멈춥니다.</w:t>
             </w:r>
           </w:p>
         </w:tc>
@@ -9394,7 +9472,7 @@
                 <w:sz w:val="18"/>
                 <w:szCs w:val="18"/>
               </w:rPr>
-              <w:t xml:space="preserve">One run trains one separation mode (RP or HILIC); a table mixing modes stops, so run each mode separately.</w:t>
+              <w:t xml:space="preserve">When a table mixes RP and HILIC, each mode is trained separately into result/RP/ and result/HILIC/. If one mode fails (for example too few rows), the other is kept with a warning; check Status in train_summary.tsv. The run stops only when every mode fails.</w:t>
             </w:r>
           </w:p>
         </w:tc>
@@ -9584,7 +9662,7 @@
                 <w:sz w:val="18"/>
                 <w:szCs w:val="18"/>
               </w:rPr>
-              <w:t xml:space="preserve">rt_unit은 이름만 기록하고 값을 바꾸지 않습니다. 이후 비교에서 같은 이름을 써야 합니다.</w:t>
+              <w:t xml:space="preserve">rt_unit은 이름만 기록하고 값을 바꾸지 않습니다. 기본값 min은 기본 모델의 단위와 같습니다. 이후 비교에서 같은 이름을 써야 합니다.</w:t>
             </w:r>
           </w:p>
         </w:tc>
@@ -9604,7 +9682,7 @@
                 <w:sz w:val="18"/>
                 <w:szCs w:val="18"/>
               </w:rPr>
-              <w:t xml:space="preserve">rt_unit is only recorded and values are not converted; use the same label in the later comparison.</w:t>
+              <w:t xml:space="preserve">rt_unit is only recorded and values are not converted; the default min matches the default models. Use the same label in the later comparison.</w:t>
             </w:r>
           </w:p>
         </w:tc>
@@ -9858,7 +9936,7 @@
           <w:sz w:val="19"/>
           <w:szCs w:val="19"/>
         </w:rPr>
-        <w:t xml:space="preserve">  rt_unit=auto \</w:t>
+        <w:t xml:space="preserve">  rt_unit=min \</w:t>
       </w:r>
     </w:p>
     <w:p>
@@ -10028,7 +10106,7 @@
         <w:t xml:space="preserve">결과 파일: </w:t>
       </w:r>
       <w:r>
-        <w:t xml:space="preserve">result/training.png</w:t>
+        <w:t xml:space="preserve">result/&lt;MODE&gt;/training.png</w:t>
       </w:r>
       <w:r>
         <w:t xml:space="preserve"> (같은 그림 </w:t>
@@ -10884,6 +10962,45 @@
     <w:p/>
     <w:p>
       <w:pPr>
+        <w:spacing w:after="120"/>
+      </w:pPr>
+      <w:r>
+        <w:rPr>
+          <w:b/>
+          <w:bCs/>
+          <w:color w:val="B0B0B0"/>
+          <w:sz w:val="18"/>
+          <w:szCs w:val="18"/>
+        </w:rPr>
+        <w:t xml:space="preserve">[내부 메모 · 붙여 넣지 마세요] </w:t>
+      </w:r>
+      <w:r>
+        <w:rPr>
+          <w:color w:val="8A8F99"/>
+          <w:sz w:val="18"/>
+          <w:szCs w:val="18"/>
+        </w:rPr>
+        <w:t xml:space="preserve">등록 메모: 작업 파일 </w:t>
+      </w:r>
+      <w:r>
+        <w:rPr>
+          <w:color w:val="8A8F99"/>
+          <w:sz w:val="18"/>
+          <w:szCs w:val="18"/>
+        </w:rPr>
+        <w:t xml:space="preserve">scripts/Retip/retip_compare.1.1.py</w:t>
+      </w:r>
+      <w:r>
+        <w:rPr>
+          <w:color w:val="8A8F99"/>
+          <w:sz w:val="18"/>
+          <w:szCs w:val="18"/>
+        </w:rPr>
+        <w:t xml:space="preserve">를 배포 번호 1.0으로 올립니다.</w:t>
+      </w:r>
+    </w:p>
+    <w:p>
+      <w:pPr>
         <w:spacing w:after="100" w:before="200"/>
       </w:pPr>
       <w:r>
@@ -12097,7 +12214,20 @@
         <w:spacing w:after="80"/>
       </w:pPr>
       <w:r>
-        <w:t xml:space="preserve">평가 표는 학습 때 떼어 둔 reserved_test.csv가 기본이며, 별도의 측정 RT 표를 줄 수도 있습니다.</w:t>
+        <w:t xml:space="preserve">학습한 모드마다 그 모드의 기본 모델과 사용자 모델을 비교하고, 모드 열이 붙은 통합 표로 모읍니다.</w:t>
+      </w:r>
+    </w:p>
+    <w:p>
+      <w:pPr>
+        <w:pStyle w:val="ListParagraph"/>
+        <w:numPr>
+          <w:ilvl w:val="0"/>
+          <w:numId w:val="2"/>
+        </w:numPr>
+        <w:spacing w:after="80"/>
+      </w:pPr>
+      <w:r>
+        <w:t xml:space="preserve">평가 표는 모드마다 학습 때 떼어 둔 reserved_test.csv가 기본이며, 별도의 측정 RT 표를 줄 수도 있습니다(두 모드를 담으면 model_type 열 필요).</w:t>
       </w:r>
     </w:p>
     <w:p>
@@ -12172,7 +12302,20 @@
         <w:spacing w:after="80"/>
       </w:pPr>
       <w:r>
-        <w:t xml:space="preserve">The evaluation table is the reserved_test.csv held out in training by default; a separate table of measured RTs can be given.</w:t>
+        <w:t xml:space="preserve">Each trained mode is compared with the default model of that mode, and the results are joined in one table with a mode column.</w:t>
+      </w:r>
+    </w:p>
+    <w:p>
+      <w:pPr>
+        <w:pStyle w:val="ListParagraph"/>
+        <w:numPr>
+          <w:ilvl w:val="0"/>
+          <w:numId w:val="2"/>
+        </w:numPr>
+        <w:spacing w:after="80"/>
+      </w:pPr>
+      <w:r>
+        <w:t xml:space="preserve">The evaluation table is the reserved_test.csv held out in training for each mode by default; a separate table of measured RTs can be given (with a model_type column when it holds both modes).</w:t>
       </w:r>
     </w:p>
     <w:p>
@@ -12537,7 +12680,7 @@
                 <w:sz w:val="18"/>
                 <w:szCs w:val="18"/>
               </w:rPr>
-              <w:t xml:space="preserve">사용자 모델 학습 결과 폴더. 안에 result/model/(model_manifest.json)과 result/reserved_test.csv가 있어야 함</w:t>
+              <w:t xml:space="preserve">retip_train 결과 폴더. 학습된 모드마다 model/과 reserved_test.csv가 있어야 함</w:t>
             </w:r>
           </w:p>
         </w:tc>
@@ -12557,7 +12700,7 @@
                 <w:sz w:val="18"/>
                 <w:szCs w:val="18"/>
               </w:rPr>
-              <w:t xml:space="preserve">Training output folder holding result/model/ (with model_manifest.json) and result/reserved_test.csv</w:t>
+              <w:t xml:space="preserve">retip_train output folder with model/ and reserved_test.csv for each trained mode</w:t>
             </w:r>
           </w:p>
         </w:tc>
@@ -12679,7 +12822,7 @@
                 <w:sz w:val="18"/>
                 <w:szCs w:val="18"/>
               </w:rPr>
-              <w:t xml:space="preserve">결과 폴더. result/에 comparison.csv, predictions_long.csv, comparison.png·.svg, report.html, manifest.json</w:t>
+              <w:t xml:space="preserve">결과 폴더. result/에 모드별 폴더(RP/, HILIC/: comparison.csv, predictions_long.csv, comparison.png·.svg, report.html, manifest.json), 모드 열이 붙은 통합 comparison.csv, compare_summary.tsv</w:t>
             </w:r>
           </w:p>
         </w:tc>
@@ -12699,7 +12842,7 @@
                 <w:sz w:val="18"/>
                 <w:szCs w:val="18"/>
               </w:rPr>
-              <w:t xml:space="preserve">Output folder: result/ holds comparison.csv, predictions_long.csv, comparison.png and .svg, report.html and manifest.json</w:t>
+              <w:t xml:space="preserve">Output folder: result/ holds a folder per mode (RP/, HILIC/: comparison.csv, predictions_long.csv, comparison.png and .svg, report.html, manifest.json), a joint comparison.csv with a Mode column, and compare_summary.tsv</w:t>
             </w:r>
           </w:p>
         </w:tc>
@@ -12741,7 +12884,7 @@
                 <w:sz w:val="18"/>
                 <w:szCs w:val="18"/>
               </w:rPr>
-              <w:t xml:space="preserve">Required</w:t>
+              <w:t xml:space="preserve">Optional</w:t>
             </w:r>
           </w:p>
         </w:tc>
@@ -12801,7 +12944,7 @@
                 <w:sz w:val="18"/>
                 <w:szCs w:val="18"/>
               </w:rPr>
-              <w:t xml:space="preserve">RP</w:t>
+              <w:t xml:space="preserve">auto</w:t>
             </w:r>
           </w:p>
         </w:tc>
@@ -12821,7 +12964,7 @@
                 <w:sz w:val="18"/>
                 <w:szCs w:val="18"/>
               </w:rPr>
-              <w:t xml:space="preserve">분리 모드(RP, HILIC). 사용자 모델의 모드와 같아야 함</w:t>
+              <w:t xml:space="preserve">비교할 모드(auto, RP, HILIC). auto = 학습된 모드 전부를 모드마다 기본 모델과 비교. RP/HILIC = 그 모드만</w:t>
             </w:r>
           </w:p>
         </w:tc>
@@ -12841,7 +12984,7 @@
                 <w:sz w:val="18"/>
                 <w:szCs w:val="18"/>
               </w:rPr>
-              <w:t xml:space="preserve">Separation mode (RP, HILIC); must match the user model</w:t>
+              <w:t xml:space="preserve">Modes to compare (auto, RP, HILIC). auto = every trained mode, each against the default model of that mode. RP/HILIC = only that mode</w:t>
             </w:r>
           </w:p>
         </w:tc>
@@ -12963,7 +13106,7 @@
                 <w:sz w:val="18"/>
                 <w:szCs w:val="18"/>
               </w:rPr>
-              <w:t xml:space="preserve">평가 표(CSV 또는 XLSX, SMILES와 측정 RT). reserved_test 또는 빈 값 = 학습 때 떼어 둔 reserved_test.csv</w:t>
+              <w:t xml:space="preserve">평가 표(CSV 또는 XLSX, SMILES와 측정 RT). 두 모드를 담으면 model_type 열 필요. reserved_test 또는 빈 값 = 모드마다 학습 때 떼어 둔 reserved_test.csv. 학습하지 않은 모드의 행은 쓰지 않음</w:t>
             </w:r>
           </w:p>
         </w:tc>
@@ -12983,7 +13126,7 @@
                 <w:sz w:val="18"/>
                 <w:szCs w:val="18"/>
               </w:rPr>
-              <w:t xml:space="preserve">Evaluation table (CSV or XLSX with SMILES and measured RT). reserved_test or empty = the reserved_test.csv held out in training</w:t>
+              <w:t xml:space="preserve">Evaluation table (CSV or XLSX with SMILES and measured RT); a model_type column is needed when it holds both modes. reserved_test or empty = the reserved_test.csv held out per mode in training. Rows of an untrained mode are not used</w:t>
             </w:r>
           </w:p>
         </w:tc>
@@ -13247,7 +13390,7 @@
                 <w:sz w:val="18"/>
                 <w:szCs w:val="18"/>
               </w:rPr>
-              <w:t xml:space="preserve">RT 단위 이름. auto 또는 빈 값 = 사용자 모델에 기록된 단위. 학습 때와 다르면 멈춤</w:t>
+              <w:t xml:space="preserve">RT 단위 이름. auto 또는 빈 값 = 모드마다 사용자 모델에 기록된 단위. 학습 때와 다르면 그 모드는 비교하지 않음</w:t>
             </w:r>
           </w:p>
         </w:tc>
@@ -13267,7 +13410,7 @@
                 <w:sz w:val="18"/>
                 <w:szCs w:val="18"/>
               </w:rPr>
-              <w:t xml:space="preserve">RT unit label. auto or empty = the unit recorded in the user model; stops if it differs from training</w:t>
+              <w:t xml:space="preserve">RT unit label. auto or empty = the unit recorded in each user model; a mode whose unit differs from training is not compared</w:t>
             </w:r>
           </w:p>
         </w:tc>
@@ -13531,7 +13674,7 @@
                 <w:sz w:val="18"/>
                 <w:szCs w:val="18"/>
               </w:rPr>
-              <w:t xml:space="preserve">보고서와 그림 제목</w:t>
+              <w:t xml:space="preserve">보고서와 그림 제목. 모드별 결과에는 뒤에 (RP), (HILIC)가 붙음</w:t>
             </w:r>
           </w:p>
         </w:tc>
@@ -13551,7 +13694,7 @@
                 <w:sz w:val="18"/>
                 <w:szCs w:val="18"/>
               </w:rPr>
-              <w:t xml:space="preserve">Title of the report and figure</w:t>
+              <w:t xml:space="preserve">Title of the report and figure; per-mode results add (RP) or (HILIC)</w:t>
             </w:r>
           </w:p>
         </w:tc>
@@ -13898,7 +14041,7 @@
                 <w:sz w:val="18"/>
                 <w:szCs w:val="18"/>
               </w:rPr>
-              <w:t xml:space="preserve">선택</w:t>
+              <w:t xml:space="preserve">조건부</w:t>
             </w:r>
           </w:p>
         </w:tc>
@@ -13918,7 +14061,7 @@
                 <w:sz w:val="18"/>
                 <w:szCs w:val="18"/>
               </w:rPr>
-              <w:t xml:space="preserve">있으면 model 인자와 같아야 함</w:t>
+              <w:t xml:space="preserve">RP 또는 HILIC(행마다). 학습한 모드가 둘이고 model=auto이면 필수</w:t>
             </w:r>
           </w:p>
         </w:tc>
@@ -14169,7 +14312,7 @@
                 <w:sz w:val="18"/>
                 <w:szCs w:val="18"/>
               </w:rPr>
-              <w:t xml:space="preserve">model은 필수이며 사용자 모델의 모드와 같아야 합니다. 비교는 같은 모드끼리만 합니다.</w:t>
+              <w:t xml:space="preserve">비교는 모드마다 같은 모드의 기본 모델과 사용자 모델 사이에서 합니다. RP와 HILIC는 RT의 뜻이 달라 서로 비교하지 않습니다. 평가 표에 학습하지 않은 모드의 행이 있으면 쓰지 않고 경고를 남깁니다. 한 모드만 실패하면 다른 모드 결과는 남기며, compare_summary.tsv의 Status로 확인할 수 있습니다.</w:t>
             </w:r>
           </w:p>
         </w:tc>
@@ -14189,7 +14332,7 @@
                 <w:sz w:val="18"/>
                 <w:szCs w:val="18"/>
               </w:rPr>
-              <w:t xml:space="preserve">model is required and must match the user model; only models of the same mode are compared.</w:t>
+              <w:t xml:space="preserve">Each mode is compared between the default and user models of that mode; RP and HILIC are not compared with each other because their RTs mean different things. Evaluation rows of an untrained mode are not used, with a warning. If one mode fails, the other's results are kept; check Status in compare_summary.tsv.</w:t>
             </w:r>
           </w:p>
         </w:tc>
@@ -14457,7 +14600,7 @@
           <w:sz w:val="19"/>
           <w:szCs w:val="19"/>
         </w:rPr>
-        <w:t xml:space="preserve">  model=RP \</w:t>
+        <w:t xml:space="preserve">  model=auto \</w:t>
       </w:r>
     </w:p>
     <w:p>
@@ -14579,7 +14722,7 @@
         <w:t xml:space="preserve">결과 파일: </w:t>
       </w:r>
       <w:r>
-        <w:t xml:space="preserve">result/comparison.png</w:t>
+        <w:t xml:space="preserve">result/&lt;MODE&gt;/comparison.png</w:t>
       </w:r>
       <w:r>
         <w:t xml:space="preserve"> (같은 그림 </w:t>
@@ -14600,7 +14743,10 @@
         <w:t xml:space="preserve">predictions_long.csv</w:t>
       </w:r>
       <w:r>
-        <w:t xml:space="preserve">)</w:t>
+        <w:t xml:space="preserve">), 모드 통합 표 </w:t>
+      </w:r>
+      <w:r>
+        <w:t xml:space="preserve">result/comparison.csv</w:t>
       </w:r>
     </w:p>
     <w:p>

</xml_diff>

<commit_message>
Retip: mode only from the model_type column (model option removed)
The mode was given twice (model_type column and the model option) with
different roles, which could disagree with the data. train 1.1, predict
1.2 and compare 1.1 now take the mode only from the model_type column
(RP or HILIC per row, required; modes may be mixed) and no longer accept
model. compare always compares every trained mode; the pairing comes from
the user model manifests. The version headers now name the right previous
version. Docs and Word files follow. Not yet run in the images.

Co-Authored-By: Claude Opus 5.5 <noreply@anthropic.com>
</commit_message>
<xml_diff>
--- a/docs/Retip/modules/Portal_Content.docx
+++ b/docs/Retip/modules/Portal_Content.docx
@@ -282,7 +282,7 @@
         <w:spacing w:after="80"/>
       </w:pPr>
       <w:r>
-        <w:t xml:space="preserve">분리 모드: 서울대 의도(2026-10-23 확인)에 따라 학습은 한 표의 RP·HILIC를 모드별로 나눠 각각 학습하고, 예측은 행마다 그 모드의 모델을 씁니다. 사용자 모델로 예측할 때 학습하지 않은 모드의 행은 예측하지 않고 표시만 합니다. 이미지와 mdcc 코드는 그대로이며 래퍼 스크립트만 바뀌었습니다.</w:t>
+        <w:t xml:space="preserve">분리 모드: 서울대 의도(2026-10-23 확인)에 따라 학습은 한 표의 RP·HILIC를 모드별로 나눠 각각 학습하고, 예측은 행마다 그 모드의 모델을 씁니다. 모드는 입력 표의 model_type 열(행마다 RP 또는 HILIC)로만 정하며, 세 모듈 모두 이 열이 필수입니다(모드를 고르는 인자는 없습니다). 사용자 모델로 예측할 때 학습하지 않은 모드의 행은 예측하지 않고 표시만 합니다. 이미지와 mdcc 코드는 그대로이며 래퍼 스크립트만 바뀌었습니다.</w:t>
       </w:r>
     </w:p>
     <w:p>
@@ -2768,7 +2768,7 @@
                 <w:sz w:val="18"/>
                 <w:szCs w:val="18"/>
               </w:rPr>
-              <w:t xml:space="preserve">화합물 표(CSV 또는 XLSX, 한 행이 화합물 하나). SMILES 열 필수. model_type 열(RP/HILIC)과 측정 RT 열은 선택이며, 모드가 섞여도 됨</w:t>
+              <w:t xml:space="preserve">화합물 표(CSV 또는 XLSX, 한 행이 화합물 하나). SMILES 열과 model_type 열(행마다 RP 또는 HILIC, 섞여도 됨) 필수. 측정 RT 열은 선택</w:t>
             </w:r>
           </w:p>
         </w:tc>
@@ -2788,7 +2788,7 @@
                 <w:sz w:val="18"/>
                 <w:szCs w:val="18"/>
               </w:rPr>
-              <w:t xml:space="preserve">Compound table (CSV or XLSX, one compound per row) with a SMILES column; model_type (RP/HILIC) and measured RT columns are optional, and modes may be mixed</w:t>
+              <w:t xml:space="preserve">Compound table (CSV or XLSX, one compound per row) with a SMILES column and a model_type column (RP or HILIC per row; modes may be mixed); a measured RT column is optional</w:t>
             </w:r>
           </w:p>
         </w:tc>
@@ -3073,148 +3073,6 @@
                 <w:szCs w:val="18"/>
               </w:rPr>
               <w:t xml:space="preserve">Model used for prediction. default or empty = the bundled default RP and HILIC models. For trained models, the retip_train output folder: each row uses the trained model of its mode, and rows of an untrained mode are kept but not predicted (parse_status=no_trained_model)</w:t>
-            </w:r>
-          </w:p>
-        </w:tc>
-      </w:tr>
-      <w:tr>
-        <w:tc>
-          <w:tcPr>
-            <w:tcW w:type="dxa" w:w="920"/>
-            <w:tcMar>
-              <w:top w:type="dxa" w:w="60"/>
-              <w:left w:type="dxa" w:w="90"/>
-              <w:bottom w:type="dxa" w:w="60"/>
-              <w:right w:type="dxa" w:w="90"/>
-            </w:tcMar>
-          </w:tcPr>
-          <w:p>
-            <w:r>
-              <w:rPr>
-                <w:sz w:val="18"/>
-                <w:szCs w:val="18"/>
-              </w:rPr>
-              <w:t xml:space="preserve">Option</w:t>
-            </w:r>
-          </w:p>
-        </w:tc>
-        <w:tc>
-          <w:tcPr>
-            <w:tcW w:type="dxa" w:w="950"/>
-            <w:tcMar>
-              <w:top w:type="dxa" w:w="60"/>
-              <w:left w:type="dxa" w:w="90"/>
-              <w:bottom w:type="dxa" w:w="60"/>
-              <w:right w:type="dxa" w:w="90"/>
-            </w:tcMar>
-          </w:tcPr>
-          <w:p>
-            <w:r>
-              <w:rPr>
-                <w:sz w:val="18"/>
-                <w:szCs w:val="18"/>
-              </w:rPr>
-              <w:t xml:space="preserve">Optional</w:t>
-            </w:r>
-          </w:p>
-        </w:tc>
-        <w:tc>
-          <w:tcPr>
-            <w:tcW w:type="dxa" w:w="950"/>
-            <w:tcMar>
-              <w:top w:type="dxa" w:w="60"/>
-              <w:left w:type="dxa" w:w="90"/>
-              <w:bottom w:type="dxa" w:w="60"/>
-              <w:right w:type="dxa" w:w="90"/>
-            </w:tcMar>
-          </w:tcPr>
-          <w:p>
-            <w:r>
-              <w:rPr>
-                <w:sz w:val="18"/>
-                <w:szCs w:val="18"/>
-              </w:rPr>
-              <w:t xml:space="preserve">List</w:t>
-            </w:r>
-          </w:p>
-        </w:tc>
-        <w:tc>
-          <w:tcPr>
-            <w:tcW w:type="dxa" w:w="1400"/>
-            <w:tcMar>
-              <w:top w:type="dxa" w:w="60"/>
-              <w:left w:type="dxa" w:w="90"/>
-              <w:bottom w:type="dxa" w:w="60"/>
-              <w:right w:type="dxa" w:w="90"/>
-            </w:tcMar>
-          </w:tcPr>
-          <w:p>
-            <w:r>
-              <w:rPr>
-                <w:sz w:val="18"/>
-                <w:szCs w:val="18"/>
-              </w:rPr>
-              <w:t xml:space="preserve">model</w:t>
-            </w:r>
-          </w:p>
-        </w:tc>
-        <w:tc>
-          <w:tcPr>
-            <w:tcW w:type="dxa" w:w="1000"/>
-            <w:tcMar>
-              <w:top w:type="dxa" w:w="60"/>
-              <w:left w:type="dxa" w:w="90"/>
-              <w:bottom w:type="dxa" w:w="60"/>
-              <w:right w:type="dxa" w:w="90"/>
-            </w:tcMar>
-          </w:tcPr>
-          <w:p>
-            <w:r>
-              <w:rPr>
-                <w:sz w:val="18"/>
-                <w:szCs w:val="18"/>
-              </w:rPr>
-              <w:t xml:space="preserve">auto</w:t>
-            </w:r>
-          </w:p>
-        </w:tc>
-        <w:tc>
-          <w:tcPr>
-            <w:tcW w:type="dxa" w:w="2140"/>
-            <w:tcMar>
-              <w:top w:type="dxa" w:w="60"/>
-              <w:left w:type="dxa" w:w="90"/>
-              <w:bottom w:type="dxa" w:w="60"/>
-              <w:right w:type="dxa" w:w="90"/>
-            </w:tcMar>
-          </w:tcPr>
-          <w:p>
-            <w:r>
-              <w:rPr>
-                <w:sz w:val="18"/>
-                <w:szCs w:val="18"/>
-              </w:rPr>
-              <w:t xml:space="preserve">분리 모드(auto, RP, HILIC). auto = 표의 model_type 열을 행마다 사용. 열이 없는 표는 기본 모델에서는 RP 또는 HILIC 지정이 필요하고, 학습 모델에서는 한 모드만 학습했을 때 그 모드로 봄. RP/HILIC = 모든 행을 그 모드로 봄(model_type 열이 있으면 같아야 함)</w:t>
-            </w:r>
-          </w:p>
-        </w:tc>
-        <w:tc>
-          <w:tcPr>
-            <w:tcW w:type="dxa" w:w="2146"/>
-            <w:tcMar>
-              <w:top w:type="dxa" w:w="60"/>
-              <w:left w:type="dxa" w:w="90"/>
-              <w:bottom w:type="dxa" w:w="60"/>
-              <w:right w:type="dxa" w:w="90"/>
-            </w:tcMar>
-          </w:tcPr>
-          <w:p>
-            <w:r>
-              <w:rPr>
-                <w:sz w:val="18"/>
-                <w:szCs w:val="18"/>
-              </w:rPr>
-              <w:t xml:space="preserve">Separation mode (auto, RP, HILIC). auto uses the model_type column per row. A table without the column needs RP or HILIC with the default models, and is taken as the trained mode when only one mode was trained. RP/HILIC treats every row as that mode (a model_type column must agree)</w:t>
             </w:r>
           </w:p>
         </w:tc>
@@ -3641,7 +3499,7 @@
                 <w:sz w:val="18"/>
                 <w:szCs w:val="18"/>
               </w:rPr>
-              <w:t xml:space="preserve">조건부</w:t>
+              <w:t xml:space="preserve">필수</w:t>
             </w:r>
           </w:p>
         </w:tc>
@@ -3661,7 +3519,7 @@
                 <w:sz w:val="18"/>
                 <w:szCs w:val="18"/>
               </w:rPr>
-              <w:t xml:space="preserve">RP 또는 HILIC(행마다, 섞어도 됨). model=auto이면 필수(학습 모델이 한 모드뿐이면 생략 가능)</w:t>
+              <w:t xml:space="preserve">RP 또는 HILIC(행마다, 섞어도 됨). 이 열로 행마다 쓸 모델을 정함</w:t>
             </w:r>
           </w:p>
         </w:tc>
@@ -4449,20 +4307,6 @@
           <w:sz w:val="19"/>
           <w:szCs w:val="19"/>
         </w:rPr>
-        <w:t xml:space="preserve">  model=auto \</w:t>
-      </w:r>
-    </w:p>
-    <w:p>
-      <w:pPr>
-        <w:shd w:fill="F3F4F6" w:color="auto" w:val="clear"/>
-        <w:spacing w:after="0"/>
-      </w:pPr>
-      <w:r>
-        <w:rPr>
-          <w:color w:val="3A3A3A"/>
-          <w:sz w:val="19"/>
-          <w:szCs w:val="19"/>
-        </w:rPr>
         <w:t xml:space="preserve">  sheet=first</w:t>
       </w:r>
     </w:p>
@@ -7077,7 +6921,7 @@
                 <w:sz w:val="18"/>
                 <w:szCs w:val="18"/>
               </w:rPr>
-              <w:t xml:space="preserve">학습 표(CSV 또는 XLSX). SMILES와 측정 RT 열 필수. model_type 열(RP/HILIC)이 있으면 모드마다 따로 학습하며, 한 표에 섞여도 됨. 모드마다 정제 후 25행, 서로 다른 구조 15개 이상 필요</w:t>
+              <w:t xml:space="preserve">학습 표(CSV 또는 XLSX). SMILES, 측정 RT, model_type 열(행마다 RP 또는 HILIC, 섞여도 됨) 필수. model_type에 있는 모드마다 따로 학습하며(RP만 있으면 RP 모델만), 모드마다 정제 후 25행, 서로 다른 구조 15개 이상 필요</w:t>
             </w:r>
           </w:p>
         </w:tc>
@@ -7097,7 +6941,7 @@
                 <w:sz w:val="18"/>
                 <w:szCs w:val="18"/>
               </w:rPr>
-              <w:t xml:space="preserve">Training table (CSV or XLSX) with SMILES and measured RT. With a model_type column (RP/HILIC), each mode is trained separately and modes may be mixed in one table. Each mode needs at least 25 rows and 15 distinct structures after cleaning</w:t>
+              <w:t xml:space="preserve">Training table (CSV or XLSX) with SMILES, measured RT and a model_type column (RP or HILIC per row; modes may be mixed). Each mode in model_type is trained separately (RP rows only give only an RP model); each mode needs at least 25 rows and 15 distinct structures after cleaning</w:t>
             </w:r>
           </w:p>
         </w:tc>
@@ -7240,148 +7084,6 @@
                 <w:szCs w:val="18"/>
               </w:rPr>
               <w:t xml:space="preserve">Output folder: result/ holds a folder per mode (RP/, HILIC/: model/, reserved_test.csv, validation_leaderboard.csv, split_assignments.csv, rejected_rows.csv, training.png and .svg, report.html, manifest.json) and train_summary.tsv; logs/ holds the logs</w:t>
-            </w:r>
-          </w:p>
-        </w:tc>
-      </w:tr>
-      <w:tr>
-        <w:tc>
-          <w:tcPr>
-            <w:tcW w:type="dxa" w:w="920"/>
-            <w:tcMar>
-              <w:top w:type="dxa" w:w="60"/>
-              <w:left w:type="dxa" w:w="90"/>
-              <w:bottom w:type="dxa" w:w="60"/>
-              <w:right w:type="dxa" w:w="90"/>
-            </w:tcMar>
-          </w:tcPr>
-          <w:p>
-            <w:r>
-              <w:rPr>
-                <w:sz w:val="18"/>
-                <w:szCs w:val="18"/>
-              </w:rPr>
-              <w:t xml:space="preserve">Option</w:t>
-            </w:r>
-          </w:p>
-        </w:tc>
-        <w:tc>
-          <w:tcPr>
-            <w:tcW w:type="dxa" w:w="950"/>
-            <w:tcMar>
-              <w:top w:type="dxa" w:w="60"/>
-              <w:left w:type="dxa" w:w="90"/>
-              <w:bottom w:type="dxa" w:w="60"/>
-              <w:right w:type="dxa" w:w="90"/>
-            </w:tcMar>
-          </w:tcPr>
-          <w:p>
-            <w:r>
-              <w:rPr>
-                <w:sz w:val="18"/>
-                <w:szCs w:val="18"/>
-              </w:rPr>
-              <w:t xml:space="preserve">Optional</w:t>
-            </w:r>
-          </w:p>
-        </w:tc>
-        <w:tc>
-          <w:tcPr>
-            <w:tcW w:type="dxa" w:w="950"/>
-            <w:tcMar>
-              <w:top w:type="dxa" w:w="60"/>
-              <w:left w:type="dxa" w:w="90"/>
-              <w:bottom w:type="dxa" w:w="60"/>
-              <w:right w:type="dxa" w:w="90"/>
-            </w:tcMar>
-          </w:tcPr>
-          <w:p>
-            <w:r>
-              <w:rPr>
-                <w:sz w:val="18"/>
-                <w:szCs w:val="18"/>
-              </w:rPr>
-              <w:t xml:space="preserve">List</w:t>
-            </w:r>
-          </w:p>
-        </w:tc>
-        <w:tc>
-          <w:tcPr>
-            <w:tcW w:type="dxa" w:w="1400"/>
-            <w:tcMar>
-              <w:top w:type="dxa" w:w="60"/>
-              <w:left w:type="dxa" w:w="90"/>
-              <w:bottom w:type="dxa" w:w="60"/>
-              <w:right w:type="dxa" w:w="90"/>
-            </w:tcMar>
-          </w:tcPr>
-          <w:p>
-            <w:r>
-              <w:rPr>
-                <w:sz w:val="18"/>
-                <w:szCs w:val="18"/>
-              </w:rPr>
-              <w:t xml:space="preserve">model</w:t>
-            </w:r>
-          </w:p>
-        </w:tc>
-        <w:tc>
-          <w:tcPr>
-            <w:tcW w:type="dxa" w:w="1000"/>
-            <w:tcMar>
-              <w:top w:type="dxa" w:w="60"/>
-              <w:left w:type="dxa" w:w="90"/>
-              <w:bottom w:type="dxa" w:w="60"/>
-              <w:right w:type="dxa" w:w="90"/>
-            </w:tcMar>
-          </w:tcPr>
-          <w:p>
-            <w:r>
-              <w:rPr>
-                <w:sz w:val="18"/>
-                <w:szCs w:val="18"/>
-              </w:rPr>
-              <w:t xml:space="preserve">auto</w:t>
-            </w:r>
-          </w:p>
-        </w:tc>
-        <w:tc>
-          <w:tcPr>
-            <w:tcW w:type="dxa" w:w="2140"/>
-            <w:tcMar>
-              <w:top w:type="dxa" w:w="60"/>
-              <w:left w:type="dxa" w:w="90"/>
-              <w:bottom w:type="dxa" w:w="60"/>
-              <w:right w:type="dxa" w:w="90"/>
-            </w:tcMar>
-          </w:tcPr>
-          <w:p>
-            <w:r>
-              <w:rPr>
-                <w:sz w:val="18"/>
-                <w:szCs w:val="18"/>
-              </w:rPr>
-              <w:t xml:space="preserve">학습할 모드(auto, RP, HILIC). auto = model_type 열에 있는 모드 전부(RP만 있으면 RP 모델만). RP/HILIC = 그 모드 행만 학습. model_type 열이 없는 표는 RP 또는 HILIC를 지정해야 함</w:t>
-            </w:r>
-          </w:p>
-        </w:tc>
-        <w:tc>
-          <w:tcPr>
-            <w:tcW w:type="dxa" w:w="2146"/>
-            <w:tcMar>
-              <w:top w:type="dxa" w:w="60"/>
-              <w:left w:type="dxa" w:w="90"/>
-              <w:bottom w:type="dxa" w:w="60"/>
-              <w:right w:type="dxa" w:w="90"/>
-            </w:tcMar>
-          </w:tcPr>
-          <w:p>
-            <w:r>
-              <w:rPr>
-                <w:sz w:val="18"/>
-                <w:szCs w:val="18"/>
-              </w:rPr>
-              <w:t xml:space="preserve">Modes to train (auto, RP, HILIC). auto = every mode in the model_type column (RP rows only give only an RP model). RP/HILIC = train only those rows. A table without a model_type column needs RP or HILIC</w:t>
             </w:r>
           </w:p>
         </w:tc>
@@ -9168,7 +8870,7 @@
                 <w:sz w:val="18"/>
                 <w:szCs w:val="18"/>
               </w:rPr>
-              <w:t xml:space="preserve">조건부</w:t>
+              <w:t xml:space="preserve">필수</w:t>
             </w:r>
           </w:p>
         </w:tc>
@@ -9188,7 +8890,7 @@
                 <w:sz w:val="18"/>
                 <w:szCs w:val="18"/>
               </w:rPr>
-              <w:t xml:space="preserve">RP 또는 HILIC(행마다, 섞어도 됨). 없으면 model 인자로 RP 또는 HILIC 지정</w:t>
+              <w:t xml:space="preserve">RP 또는 HILIC(행마다, 섞어도 됨). 모드마다 모델을 따로 학습</w:t>
             </w:r>
           </w:p>
         </w:tc>
@@ -9908,20 +9610,6 @@
           <w:sz w:val="19"/>
           <w:szCs w:val="19"/>
         </w:rPr>
-        <w:t xml:space="preserve">  model=auto \</w:t>
-      </w:r>
-    </w:p>
-    <w:p>
-      <w:pPr>
-        <w:shd w:fill="F3F4F6" w:color="auto" w:val="clear"/>
-        <w:spacing w:after="0"/>
-      </w:pPr>
-      <w:r>
-        <w:rPr>
-          <w:color w:val="3A3A3A"/>
-          <w:sz w:val="19"/>
-          <w:szCs w:val="19"/>
-        </w:rPr>
         <w:t xml:space="preserve">  sheet=first \</w:t>
       </w:r>
     </w:p>
@@ -12227,7 +11915,7 @@
         <w:spacing w:after="80"/>
       </w:pPr>
       <w:r>
-        <w:t xml:space="preserve">평가 표는 모드마다 학습 때 떼어 둔 reserved_test.csv가 기본이며, 별도의 측정 RT 표를 줄 수도 있습니다(두 모드를 담으면 model_type 열 필요).</w:t>
+        <w:t xml:space="preserve">평가 표는 모드마다 학습 때 떼어 둔 reserved_test.csv가 기본이며, 별도의 측정 RT 표(model_type 열 필요)를 줄 수도 있습니다.</w:t>
       </w:r>
     </w:p>
     <w:p>
@@ -12315,7 +12003,7 @@
         <w:spacing w:after="80"/>
       </w:pPr>
       <w:r>
-        <w:t xml:space="preserve">The evaluation table is the reserved_test.csv held out in training for each mode by default; a separate table of measured RTs can be given (with a model_type column when it holds both modes).</w:t>
+        <w:t xml:space="preserve">The evaluation table is the reserved_test.csv held out in training for each mode by default; a separate table of measured RTs (with a model_type column) can be given.</w:t>
       </w:r>
     </w:p>
     <w:p>
@@ -12864,7 +12552,7 @@
                 <w:sz w:val="18"/>
                 <w:szCs w:val="18"/>
               </w:rPr>
-              <w:t xml:space="preserve">Option</w:t>
+              <w:t xml:space="preserve">Input</w:t>
             </w:r>
           </w:p>
         </w:tc>
@@ -12904,7 +12592,7 @@
                 <w:sz w:val="18"/>
                 <w:szCs w:val="18"/>
               </w:rPr>
-              <w:t xml:space="preserve">List</w:t>
+              <w:t xml:space="preserve">File</w:t>
             </w:r>
           </w:p>
         </w:tc>
@@ -12924,7 +12612,7 @@
                 <w:sz w:val="18"/>
                 <w:szCs w:val="18"/>
               </w:rPr>
-              <w:t xml:space="preserve">model</w:t>
+              <w:t xml:space="preserve">eval_file</w:t>
             </w:r>
           </w:p>
         </w:tc>
@@ -12944,7 +12632,7 @@
                 <w:sz w:val="18"/>
                 <w:szCs w:val="18"/>
               </w:rPr>
-              <w:t xml:space="preserve">auto</w:t>
+              <w:t xml:space="preserve">reserved_test</w:t>
             </w:r>
           </w:p>
         </w:tc>
@@ -12964,7 +12652,7 @@
                 <w:sz w:val="18"/>
                 <w:szCs w:val="18"/>
               </w:rPr>
-              <w:t xml:space="preserve">비교할 모드(auto, RP, HILIC). auto = 학습된 모드 전부를 모드마다 기본 모델과 비교. RP/HILIC = 그 모드만</w:t>
+              <w:t xml:space="preserve">평가 표(CSV 또는 XLSX). SMILES, 측정 RT, model_type 열(행마다 RP 또는 HILIC) 필수. reserved_test 또는 빈 값 = 모드마다 학습 때 떼어 둔 reserved_test.csv. 학습하지 않은 모드의 행은 쓰지 않음</w:t>
             </w:r>
           </w:p>
         </w:tc>
@@ -12984,149 +12672,7 @@
                 <w:sz w:val="18"/>
                 <w:szCs w:val="18"/>
               </w:rPr>
-              <w:t xml:space="preserve">Modes to compare (auto, RP, HILIC). auto = every trained mode, each against the default model of that mode. RP/HILIC = only that mode</w:t>
-            </w:r>
-          </w:p>
-        </w:tc>
-      </w:tr>
-      <w:tr>
-        <w:tc>
-          <w:tcPr>
-            <w:tcW w:type="dxa" w:w="920"/>
-            <w:tcMar>
-              <w:top w:type="dxa" w:w="60"/>
-              <w:left w:type="dxa" w:w="90"/>
-              <w:bottom w:type="dxa" w:w="60"/>
-              <w:right w:type="dxa" w:w="90"/>
-            </w:tcMar>
-          </w:tcPr>
-          <w:p>
-            <w:r>
-              <w:rPr>
-                <w:sz w:val="18"/>
-                <w:szCs w:val="18"/>
-              </w:rPr>
-              <w:t xml:space="preserve">Input</w:t>
-            </w:r>
-          </w:p>
-        </w:tc>
-        <w:tc>
-          <w:tcPr>
-            <w:tcW w:type="dxa" w:w="950"/>
-            <w:tcMar>
-              <w:top w:type="dxa" w:w="60"/>
-              <w:left w:type="dxa" w:w="90"/>
-              <w:bottom w:type="dxa" w:w="60"/>
-              <w:right w:type="dxa" w:w="90"/>
-            </w:tcMar>
-          </w:tcPr>
-          <w:p>
-            <w:r>
-              <w:rPr>
-                <w:sz w:val="18"/>
-                <w:szCs w:val="18"/>
-              </w:rPr>
-              <w:t xml:space="preserve">Optional</w:t>
-            </w:r>
-          </w:p>
-        </w:tc>
-        <w:tc>
-          <w:tcPr>
-            <w:tcW w:type="dxa" w:w="950"/>
-            <w:tcMar>
-              <w:top w:type="dxa" w:w="60"/>
-              <w:left w:type="dxa" w:w="90"/>
-              <w:bottom w:type="dxa" w:w="60"/>
-              <w:right w:type="dxa" w:w="90"/>
-            </w:tcMar>
-          </w:tcPr>
-          <w:p>
-            <w:r>
-              <w:rPr>
-                <w:sz w:val="18"/>
-                <w:szCs w:val="18"/>
-              </w:rPr>
-              <w:t xml:space="preserve">File</w:t>
-            </w:r>
-          </w:p>
-        </w:tc>
-        <w:tc>
-          <w:tcPr>
-            <w:tcW w:type="dxa" w:w="1400"/>
-            <w:tcMar>
-              <w:top w:type="dxa" w:w="60"/>
-              <w:left w:type="dxa" w:w="90"/>
-              <w:bottom w:type="dxa" w:w="60"/>
-              <w:right w:type="dxa" w:w="90"/>
-            </w:tcMar>
-          </w:tcPr>
-          <w:p>
-            <w:r>
-              <w:rPr>
-                <w:sz w:val="18"/>
-                <w:szCs w:val="18"/>
-              </w:rPr>
-              <w:t xml:space="preserve">eval_file</w:t>
-            </w:r>
-          </w:p>
-        </w:tc>
-        <w:tc>
-          <w:tcPr>
-            <w:tcW w:type="dxa" w:w="1000"/>
-            <w:tcMar>
-              <w:top w:type="dxa" w:w="60"/>
-              <w:left w:type="dxa" w:w="90"/>
-              <w:bottom w:type="dxa" w:w="60"/>
-              <w:right w:type="dxa" w:w="90"/>
-            </w:tcMar>
-          </w:tcPr>
-          <w:p>
-            <w:r>
-              <w:rPr>
-                <w:sz w:val="18"/>
-                <w:szCs w:val="18"/>
-              </w:rPr>
-              <w:t xml:space="preserve">reserved_test</w:t>
-            </w:r>
-          </w:p>
-        </w:tc>
-        <w:tc>
-          <w:tcPr>
-            <w:tcW w:type="dxa" w:w="2140"/>
-            <w:tcMar>
-              <w:top w:type="dxa" w:w="60"/>
-              <w:left w:type="dxa" w:w="90"/>
-              <w:bottom w:type="dxa" w:w="60"/>
-              <w:right w:type="dxa" w:w="90"/>
-            </w:tcMar>
-          </w:tcPr>
-          <w:p>
-            <w:r>
-              <w:rPr>
-                <w:sz w:val="18"/>
-                <w:szCs w:val="18"/>
-              </w:rPr>
-              <w:t xml:space="preserve">평가 표(CSV 또는 XLSX, SMILES와 측정 RT). 두 모드를 담으면 model_type 열 필요. reserved_test 또는 빈 값 = 모드마다 학습 때 떼어 둔 reserved_test.csv. 학습하지 않은 모드의 행은 쓰지 않음</w:t>
-            </w:r>
-          </w:p>
-        </w:tc>
-        <w:tc>
-          <w:tcPr>
-            <w:tcW w:type="dxa" w:w="2146"/>
-            <w:tcMar>
-              <w:top w:type="dxa" w:w="60"/>
-              <w:left w:type="dxa" w:w="90"/>
-              <w:bottom w:type="dxa" w:w="60"/>
-              <w:right w:type="dxa" w:w="90"/>
-            </w:tcMar>
-          </w:tcPr>
-          <w:p>
-            <w:r>
-              <w:rPr>
-                <w:sz w:val="18"/>
-                <w:szCs w:val="18"/>
-              </w:rPr>
-              <w:t xml:space="preserve">Evaluation table (CSV or XLSX with SMILES and measured RT); a model_type column is needed when it holds both modes. reserved_test or empty = the reserved_test.csv held out per mode in training. Rows of an untrained mode are not used</w:t>
+              <w:t xml:space="preserve">Evaluation table (CSV or XLSX) with SMILES, measured RT and a model_type column (RP or HILIC per row). reserved_test or empty = the reserved_test.csv held out per mode in training. Rows of an untrained mode are not used</w:t>
             </w:r>
           </w:p>
         </w:tc>
@@ -14041,7 +13587,7 @@
                 <w:sz w:val="18"/>
                 <w:szCs w:val="18"/>
               </w:rPr>
-              <w:t xml:space="preserve">조건부</w:t>
+              <w:t xml:space="preserve">필수</w:t>
             </w:r>
           </w:p>
         </w:tc>
@@ -14061,7 +13607,7 @@
                 <w:sz w:val="18"/>
                 <w:szCs w:val="18"/>
               </w:rPr>
-              <w:t xml:space="preserve">RP 또는 HILIC(행마다). 학습한 모드가 둘이고 model=auto이면 필수</w:t>
+              <w:t xml:space="preserve">RP 또는 HILIC(행마다). 같은 모드의 모델끼리 비교하는 데 씀</w:t>
             </w:r>
           </w:p>
         </w:tc>
@@ -14587,20 +14133,6 @@
           <w:szCs w:val="19"/>
         </w:rPr>
         <w:t xml:space="preserve">  output_dir=/data/retip_compare \</w:t>
-      </w:r>
-    </w:p>
-    <w:p>
-      <w:pPr>
-        <w:shd w:fill="F3F4F6" w:color="auto" w:val="clear"/>
-        <w:spacing w:after="0"/>
-      </w:pPr>
-      <w:r>
-        <w:rPr>
-          <w:color w:val="3A3A3A"/>
-          <w:sz w:val="19"/>
-          <w:szCs w:val="19"/>
-        </w:rPr>
-        <w:t xml:space="preserve">  model=auto \</w:t>
       </w:r>
     </w:p>
     <w:p>

</xml_diff>